<commit_message>
Roteiro de revisão: incorpora dados informados, inconsistências, lacunas e objetivos com um verbo
Co-Authored-By: Claude Opus 5.5 <noreply@anthropic.com>
Claude-Session: https://claude.ai/code/session_01HxStpW4pQoDfJdTDYr6zEC
</commit_message>
<xml_diff>
--- a/revisao_escala_municipal/ROTEIRO_REVISAO_SECRETARIA_A_ESCOLA.docx
+++ b/revisao_escala_municipal/ROTEIRO_REVISAO_SECRETARIA_A_ESCOLA.docx
@@ -569,7 +569,7 @@
         <w:t xml:space="preserve">Tibau e Tibau do Sul. </w:t>
       </w:r>
       <w:r>
-        <w:t>A busca sobre o Plano Municipal de Educação trouxe a Lei Complementar nº 734/2025, que é do município de Tibau, e não de Tibau do Sul. É preciso cuidado com esse homônimo em todas as buscas.</w:t>
+        <w:t>A busca sobre o Plano Municipal de Educação trouxe a Lei Complementar nº 734/2025, que pertence ao município de Tibau (conhecido como Tibau do Norte, na Costa Branca). Deve ser descartada.</w:t>
       </w:r>
     </w:p>
     <w:p>
@@ -577,55 +577,7 @@
         <w:pStyle w:val="Heading2"/>
       </w:pPr>
       <w:r>
-        <w:t>2.3 Não encontrado</w:t>
-      </w:r>
-    </w:p>
-    <w:p>
-      <w:pPr>
-        <w:pStyle w:val="ListBullet"/>
-      </w:pPr>
-      <w:r>
-        <w:t>Divisão da população entre área urbana e rural (Censo 2010 ou 2022).</w:t>
-      </w:r>
-    </w:p>
-    <w:p>
-      <w:pPr>
-        <w:pStyle w:val="ListBullet"/>
-      </w:pPr>
-      <w:r>
-        <w:t>Lista oficial das localidades e povoados do município.</w:t>
-      </w:r>
-    </w:p>
-    <w:p>
-      <w:pPr>
-        <w:pStyle w:val="ListBullet"/>
-      </w:pPr>
-      <w:r>
-        <w:t>Plano Municipal de Educação de Tibau do Sul (lei e vigência).</w:t>
-      </w:r>
-    </w:p>
-    <w:p>
-      <w:pPr>
-        <w:pStyle w:val="ListBullet"/>
-      </w:pPr>
-      <w:r>
-        <w:t>Número de escolas, matrículas por escola e por localidade, IDEB da rede.</w:t>
-      </w:r>
-    </w:p>
-    <w:p>
-      <w:pPr>
-        <w:pStyle w:val="ListBullet"/>
-      </w:pPr>
-      <w:r>
-        <w:t>População quilombola do município no Censo 2022.</w:t>
-      </w:r>
-    </w:p>
-    <w:p>
-      <w:pPr>
-        <w:pStyle w:val="ListBullet"/>
-      </w:pPr>
-      <w:r>
-        <w:t>Qualquer documento público da SME sobre educação digital, formação ou o plano citado pelo técnico.</w:t>
+        <w:t>2.3 Dados informados pela pesquisadora (levantamento próprio)</w:t>
       </w:r>
     </w:p>
     <w:p>
@@ -636,7 +588,615 @@
         <w:rPr>
           <w:i w:val="0"/>
         </w:rPr>
-        <w:t>Esses dados terão de vir da SME, do Censo Escolar (microdados do INEP), do IBGE e de visitas às localidades.</w:t>
+        <w:t>Os dados abaixo foram levantados pela pesquisadora para cobrir o que a busca não encontrou. As buscas feitas aqui não confirmaram nenhum deles, e o levantamento veio sem endereço das fontes. Antes de entrar na tese, cada dado precisa da referência primária (tabela do IBGE, microdado do INEP, texto da lei).</w:t>
+      </w:r>
+    </w:p>
+    <w:tbl>
+      <w:tblPr>
+        <w:tblStyle w:val="TableGrid"/>
+        <w:tblW w:type="auto" w:w="0"/>
+        <w:tblLook w:firstColumn="1" w:firstRow="1" w:lastColumn="0" w:lastRow="0" w:noHBand="0" w:noVBand="1" w:val="04A0"/>
+      </w:tblPr>
+      <w:tblGrid>
+        <w:gridCol w:w="3135"/>
+        <w:gridCol w:w="3135"/>
+        <w:gridCol w:w="3135"/>
+      </w:tblGrid>
+      <w:tr>
+        <w:tc>
+          <w:tcPr>
+            <w:tcW w:type="dxa" w:w="3135"/>
+            <w:shd w:val="clear" w:color="auto" w:fill="FFCE32"/>
+          </w:tcPr>
+          <w:p>
+            <w:r/>
+            <w:r>
+              <w:rPr>
+                <w:b/>
+              </w:rPr>
+              <w:t>Dado informado</w:t>
+            </w:r>
+          </w:p>
+        </w:tc>
+        <w:tc>
+          <w:tcPr>
+            <w:tcW w:type="dxa" w:w="3135"/>
+            <w:shd w:val="clear" w:color="auto" w:fill="FFCE32"/>
+          </w:tcPr>
+          <w:p>
+            <w:r/>
+            <w:r>
+              <w:rPr>
+                <w:b/>
+              </w:rPr>
+              <w:t>Fonte a citar</w:t>
+            </w:r>
+          </w:p>
+        </w:tc>
+        <w:tc>
+          <w:tcPr>
+            <w:tcW w:type="dxa" w:w="3135"/>
+            <w:shd w:val="clear" w:color="auto" w:fill="FFCE32"/>
+          </w:tcPr>
+          <w:p>
+            <w:r/>
+            <w:r>
+              <w:rPr>
+                <w:b/>
+              </w:rPr>
+              <w:t>Situação</w:t>
+            </w:r>
+          </w:p>
+        </w:tc>
+      </w:tr>
+      <w:tr>
+        <w:tc>
+          <w:tcPr>
+            <w:tcW w:type="dxa" w:w="3135"/>
+          </w:tcPr>
+          <w:p>
+            <w:r>
+              <w:rPr>
+                <w:sz w:val="20"/>
+              </w:rPr>
+              <w:t>Censo 2010: 11.385 habitantes, 6.861 urbanos (60,2%) e 4.524 rurais (39,8%). Censo 2022: 16.929, sem divisão urbano/rural publicada para o município.</w:t>
+            </w:r>
+          </w:p>
+        </w:tc>
+        <w:tc>
+          <w:tcPr>
+            <w:tcW w:type="dxa" w:w="3135"/>
+          </w:tcPr>
+          <w:p>
+            <w:r>
+              <w:rPr>
+                <w:sz w:val="20"/>
+              </w:rPr>
+              <w:t>IBGE, SIDRA, tabela de população por situação do domicílio (2010)</w:t>
+            </w:r>
+          </w:p>
+        </w:tc>
+        <w:tc>
+          <w:tcPr>
+            <w:tcW w:type="dxa" w:w="3135"/>
+          </w:tcPr>
+          <w:p>
+            <w:r>
+              <w:rPr>
+                <w:sz w:val="20"/>
+              </w:rPr>
+              <w:t>Conferir número e tabela</w:t>
+            </w:r>
+          </w:p>
+        </w:tc>
+      </w:tr>
+      <w:tr>
+        <w:tc>
+          <w:tcPr>
+            <w:tcW w:type="dxa" w:w="3135"/>
+          </w:tcPr>
+          <w:p>
+            <w:r>
+              <w:rPr>
+                <w:sz w:val="20"/>
+              </w:rPr>
+              <w:t>Localidades: sede (Tibau do Sul), Pipa, Sibaúma, Umari, Piau, Bela Vista, Manimbu, Munim, Cabeceiras e Pernambuquinho.</w:t>
+            </w:r>
+          </w:p>
+        </w:tc>
+        <w:tc>
+          <w:tcPr>
+            <w:tcW w:type="dxa" w:w="3135"/>
+          </w:tcPr>
+          <w:p>
+            <w:r>
+              <w:rPr>
+                <w:sz w:val="20"/>
+              </w:rPr>
+              <w:t>Falta a fonte: lei municipal, cadastro da Prefeitura ou base de localidades do IBGE</w:t>
+            </w:r>
+          </w:p>
+        </w:tc>
+        <w:tc>
+          <w:tcPr>
+            <w:tcW w:type="dxa" w:w="3135"/>
+          </w:tcPr>
+          <w:p>
+            <w:r>
+              <w:rPr>
+                <w:sz w:val="20"/>
+              </w:rPr>
+              <w:t>Sem fonte; "oficialmente" não pode ser afirmado</w:t>
+            </w:r>
+          </w:p>
+        </w:tc>
+      </w:tr>
+      <w:tr>
+        <w:tc>
+          <w:tcPr>
+            <w:tcW w:type="dxa" w:w="3135"/>
+          </w:tcPr>
+          <w:p>
+            <w:r>
+              <w:rPr>
+                <w:sz w:val="20"/>
+              </w:rPr>
+              <w:t>PME: Lei Municipal nº 517, de 24 de junho de 2015, com vigência de dez anos (2015-2025).</w:t>
+            </w:r>
+          </w:p>
+        </w:tc>
+        <w:tc>
+          <w:tcPr>
+            <w:tcW w:type="dxa" w:w="3135"/>
+          </w:tcPr>
+          <w:p>
+            <w:r>
+              <w:rPr>
+                <w:sz w:val="20"/>
+              </w:rPr>
+              <w:t>Texto da lei (Câmara ou Prefeitura)</w:t>
+            </w:r>
+          </w:p>
+        </w:tc>
+        <w:tc>
+          <w:tcPr>
+            <w:tcW w:type="dxa" w:w="3135"/>
+          </w:tcPr>
+          <w:p>
+            <w:r>
+              <w:rPr>
+                <w:sz w:val="20"/>
+              </w:rPr>
+              <w:t>Conferir; a busca aqui não encontrou a lei</w:t>
+            </w:r>
+          </w:p>
+        </w:tc>
+      </w:tr>
+      <w:tr>
+        <w:tc>
+          <w:tcPr>
+            <w:tcW w:type="dxa" w:w="3135"/>
+          </w:tcPr>
+          <w:p>
+            <w:r>
+              <w:rPr>
+                <w:sz w:val="20"/>
+              </w:rPr>
+              <w:t>Escola Domitila: código INEP 24301310, localização urbana no Censo Escolar.</w:t>
+            </w:r>
+          </w:p>
+        </w:tc>
+        <w:tc>
+          <w:tcPr>
+            <w:tcW w:type="dxa" w:w="3135"/>
+          </w:tcPr>
+          <w:p>
+            <w:r>
+              <w:rPr>
+                <w:sz w:val="20"/>
+              </w:rPr>
+              <w:t>Censo Escolar/INEP, ficha da escola</w:t>
+            </w:r>
+          </w:p>
+        </w:tc>
+        <w:tc>
+          <w:tcPr>
+            <w:tcW w:type="dxa" w:w="3135"/>
+          </w:tcPr>
+          <w:p>
+            <w:r>
+              <w:rPr>
+                <w:sz w:val="20"/>
+              </w:rPr>
+              <w:t>Conferir o código e a localização</w:t>
+            </w:r>
+          </w:p>
+        </w:tc>
+      </w:tr>
+      <w:tr>
+        <w:tc>
+          <w:tcPr>
+            <w:tcW w:type="dxa" w:w="3135"/>
+          </w:tcPr>
+          <w:p>
+            <w:r>
+              <w:rPr>
+                <w:sz w:val="20"/>
+              </w:rPr>
+              <w:t>"Distrito de Piau" é uso local; o IBGE reconhece só o distrito sede.</w:t>
+            </w:r>
+          </w:p>
+        </w:tc>
+        <w:tc>
+          <w:tcPr>
+            <w:tcW w:type="dxa" w:w="3135"/>
+          </w:tcPr>
+          <w:p>
+            <w:r>
+              <w:rPr>
+                <w:sz w:val="20"/>
+              </w:rPr>
+              <w:t>IBGE, Divisão Territorial Brasileira</w:t>
+            </w:r>
+          </w:p>
+        </w:tc>
+        <w:tc>
+          <w:tcPr>
+            <w:tcW w:type="dxa" w:w="3135"/>
+          </w:tcPr>
+          <w:p>
+            <w:r>
+              <w:rPr>
+                <w:sz w:val="20"/>
+              </w:rPr>
+              <w:t>Coerente com a busca; usar "localidade" ou "povoado"</w:t>
+            </w:r>
+          </w:p>
+        </w:tc>
+      </w:tr>
+      <w:tr>
+        <w:tc>
+          <w:tcPr>
+            <w:tcW w:type="dxa" w:w="3135"/>
+          </w:tcPr>
+          <w:p>
+            <w:r>
+              <w:rPr>
+                <w:sz w:val="20"/>
+              </w:rPr>
+              <w:t>Rede pública (municipal e estadual): cerca de 11 escolas e 2.801 matrículas.</w:t>
+            </w:r>
+          </w:p>
+        </w:tc>
+        <w:tc>
+          <w:tcPr>
+            <w:tcW w:type="dxa" w:w="3135"/>
+          </w:tcPr>
+          <w:p>
+            <w:r>
+              <w:rPr>
+                <w:sz w:val="20"/>
+              </w:rPr>
+              <w:t>INEP/QEdu, com ano de referência</w:t>
+            </w:r>
+          </w:p>
+        </w:tc>
+        <w:tc>
+          <w:tcPr>
+            <w:tcW w:type="dxa" w:w="3135"/>
+          </w:tcPr>
+          <w:p>
+            <w:r>
+              <w:rPr>
+                <w:sz w:val="20"/>
+              </w:rPr>
+              <w:t>Conferir; separar rede municipal e estadual</w:t>
+            </w:r>
+          </w:p>
+        </w:tc>
+      </w:tr>
+      <w:tr>
+        <w:tc>
+          <w:tcPr>
+            <w:tcW w:type="dxa" w:w="3135"/>
+          </w:tcPr>
+          <w:p>
+            <w:r>
+              <w:rPr>
+                <w:sz w:val="20"/>
+              </w:rPr>
+              <w:t>IDEB 2023 da rede municipal: 5,0 nos anos iniciais e 4,6 nos anos finais.</w:t>
+            </w:r>
+          </w:p>
+        </w:tc>
+        <w:tc>
+          <w:tcPr>
+            <w:tcW w:type="dxa" w:w="3135"/>
+          </w:tcPr>
+          <w:p>
+            <w:r>
+              <w:rPr>
+                <w:sz w:val="20"/>
+              </w:rPr>
+              <w:t>INEP, resultados do IDEB 2023</w:t>
+            </w:r>
+          </w:p>
+        </w:tc>
+        <w:tc>
+          <w:tcPr>
+            <w:tcW w:type="dxa" w:w="3135"/>
+          </w:tcPr>
+          <w:p>
+            <w:r>
+              <w:rPr>
+                <w:sz w:val="20"/>
+              </w:rPr>
+              <w:t>Conferir</w:t>
+            </w:r>
+          </w:p>
+        </w:tc>
+      </w:tr>
+      <w:tr>
+        <w:tc>
+          <w:tcPr>
+            <w:tcW w:type="dxa" w:w="3135"/>
+          </w:tcPr>
+          <w:p>
+            <w:r>
+              <w:rPr>
+                <w:sz w:val="20"/>
+              </w:rPr>
+              <w:t>Censo 2022: 903 pessoas quilombolas em Tibau do Sul, concentradas em Sibaúma.</w:t>
+            </w:r>
+          </w:p>
+        </w:tc>
+        <w:tc>
+          <w:tcPr>
+            <w:tcW w:type="dxa" w:w="3135"/>
+          </w:tcPr>
+          <w:p>
+            <w:r>
+              <w:rPr>
+                <w:sz w:val="20"/>
+              </w:rPr>
+              <w:t>IBGE, Censo 2022, quilombolas por município</w:t>
+            </w:r>
+          </w:p>
+        </w:tc>
+        <w:tc>
+          <w:tcPr>
+            <w:tcW w:type="dxa" w:w="3135"/>
+          </w:tcPr>
+          <w:p>
+            <w:r>
+              <w:rPr>
+                <w:sz w:val="20"/>
+              </w:rPr>
+              <w:t>Conferir; a concentração em Sibaúma também precisa de fonte</w:t>
+            </w:r>
+          </w:p>
+        </w:tc>
+      </w:tr>
+      <w:tr>
+        <w:tc>
+          <w:tcPr>
+            <w:tcW w:type="dxa" w:w="3135"/>
+          </w:tcPr>
+          <w:p>
+            <w:r>
+              <w:rPr>
+                <w:sz w:val="20"/>
+              </w:rPr>
+              <w:t>Não há documento público da SME sobre educação digital em transparência ativa; pedir via e-SIC (Lei de Acesso à Informação).</w:t>
+            </w:r>
+          </w:p>
+        </w:tc>
+        <w:tc>
+          <w:tcPr>
+            <w:tcW w:type="dxa" w:w="3135"/>
+          </w:tcPr>
+          <w:p>
+            <w:r>
+              <w:rPr>
+                <w:sz w:val="20"/>
+              </w:rPr>
+              <w:t>Pesquisa nos portais e diários oficiais</w:t>
+            </w:r>
+          </w:p>
+        </w:tc>
+        <w:tc>
+          <w:tcPr>
+            <w:tcW w:type="dxa" w:w="3135"/>
+          </w:tcPr>
+          <w:p>
+            <w:r>
+              <w:rPr>
+                <w:sz w:val="20"/>
+              </w:rPr>
+              <w:t>Coerente com a busca</w:t>
+            </w:r>
+          </w:p>
+        </w:tc>
+      </w:tr>
+    </w:tbl>
+    <w:p/>
+    <w:p>
+      <w:pPr>
+        <w:pStyle w:val="Heading2"/>
+      </w:pPr>
+      <w:r>
+        <w:t>2.4 Inconsistências a resolver nesse levantamento</w:t>
+      </w:r>
+    </w:p>
+    <w:p>
+      <w:pPr>
+        <w:pStyle w:val="ListBullet"/>
+      </w:pPr>
+      <w:r>
+        <w:rPr>
+          <w:b/>
+        </w:rPr>
+        <w:t xml:space="preserve">Lei do PME. </w:t>
+      </w:r>
+      <w:r>
+        <w:t>O texto recebido diz que a Lei nº 517/2015 foi "levantada na etapa anterior". Ela não foi: a busca anterior não encontrou o PME. A informação depende de conferência no texto da lei.</w:t>
+      </w:r>
+    </w:p>
+    <w:p>
+      <w:pPr>
+        <w:pStyle w:val="ListBullet"/>
+      </w:pPr>
+      <w:r>
+        <w:rPr>
+          <w:b/>
+        </w:rPr>
+        <w:t xml:space="preserve">Matrículas. </w:t>
+      </w:r>
+      <w:r>
+        <w:t>Só a Escola Domitila tem 351 crianças nos anos iniciais (TIBAU DO SUL, 2026). As 2.801 matrículas em 11 escolas públicas parecem baixas para um município de 16.929 habitantes. É preciso saber o ano, a fonte e se o número cobre todas as etapas e as duas redes.</w:t>
+      </w:r>
+    </w:p>
+    <w:p>
+      <w:pPr>
+        <w:pStyle w:val="ListBullet"/>
+      </w:pPr>
+      <w:r>
+        <w:rPr>
+          <w:b/>
+        </w:rPr>
+        <w:t xml:space="preserve">Localidades. </w:t>
+      </w:r>
+      <w:r>
+        <w:t>A lista mistura localidades de natureza diferente (o distrito sede, povoados, uma comunidade quilombola). Para a tese, convém indicar a fonte e, se possível, a situação de cada uma (urbana ou rural).</w:t>
+      </w:r>
+    </w:p>
+    <w:p>
+      <w:pPr>
+        <w:pStyle w:val="ListBullet"/>
+      </w:pPr>
+      <w:r>
+        <w:rPr>
+          <w:b/>
+        </w:rPr>
+        <w:t xml:space="preserve">Crescimento. </w:t>
+      </w:r>
+      <w:r>
+        <w:t>Uma das buscas indicou cerca de 14.500 habitantes em 2020 (estimativa), compatível com o salto entre 2010 e 2022. O crescimento de quase 50% em doze anos é, por si, um dado relevante para a tese.</w:t>
+      </w:r>
+    </w:p>
+    <w:p>
+      <w:pPr>
+        <w:pStyle w:val="Heading2"/>
+      </w:pPr>
+      <w:r>
+        <w:t>2.5 O que ainda falta levantar</w:t>
+      </w:r>
+    </w:p>
+    <w:p>
+      <w:pPr>
+        <w:pStyle w:val="ListBullet"/>
+      </w:pPr>
+      <w:r>
+        <w:t>A fonte de cada dado da seção 2.3 (tabela, microdado ou texto da lei, com ano e endereço).</w:t>
+      </w:r>
+    </w:p>
+    <w:p>
+      <w:pPr>
+        <w:pStyle w:val="ListBullet"/>
+      </w:pPr>
+      <w:r>
+        <w:t>Situação do PME depois de 2025: houve prorrogação ou novo plano? O novo PNE (Lei nº 15.388/2026) pede a adequação dos planos locais, o que precisa ser conferido no texto da lei.</w:t>
+      </w:r>
+    </w:p>
+    <w:p>
+      <w:pPr>
+        <w:pStyle w:val="ListBullet"/>
+      </w:pPr>
+      <w:r>
+        <w:t>Metas do PME sobre tecnologia, educação do campo e educação escolar quilombola.</w:t>
+      </w:r>
+    </w:p>
+    <w:p>
+      <w:pPr>
+        <w:pStyle w:val="ListBullet"/>
+      </w:pPr>
+      <w:r>
+        <w:t>Lista só da rede municipal, escola por escola: localidade, situação urbana ou rural, etapas, matrículas, internet, laboratório.</w:t>
+      </w:r>
+    </w:p>
+    <w:p>
+      <w:pPr>
+        <w:pStyle w:val="ListBullet"/>
+      </w:pPr>
+      <w:r>
+        <w:t>Escolas que o Censo Escolar marca em área remanescente de quilombo ou com educação escolar quilombola; se a Escola Padre Armando de Paiva aparece assim.</w:t>
+      </w:r>
+    </w:p>
+    <w:p>
+      <w:pPr>
+        <w:pStyle w:val="ListBullet"/>
+      </w:pPr>
+      <w:r>
+        <w:t>Situação de Sibaúma além da certificação de 2005: processo de titulação do território, se houver.</w:t>
+      </w:r>
+    </w:p>
+    <w:p>
+      <w:pPr>
+        <w:pStyle w:val="ListBullet"/>
+      </w:pPr>
+      <w:r>
+        <w:t>Existência de Sistema Municipal de Ensino e de Conselho Municipal de Educação, e qual currículo a rede adota (próprio ou o documento curricular do estado).</w:t>
+      </w:r>
+    </w:p>
+    <w:p>
+      <w:pPr>
+        <w:pStyle w:val="ListBullet"/>
+      </w:pPr>
+      <w:r>
+        <w:t>O "plano para a rede" citado pelo técnico: nome, data, aprovação, se trata de educação digital e se diferencia localidades.</w:t>
+      </w:r>
+    </w:p>
+    <w:p>
+      <w:pPr>
+        <w:pStyle w:val="ListBullet"/>
+      </w:pPr>
+      <w:r>
+        <w:t>Formações em educação digital já oferecidas à rede: quem ofertou, quando, para quem.</w:t>
+      </w:r>
+    </w:p>
+    <w:p>
+      <w:pPr>
+        <w:pStyle w:val="ListBullet"/>
+      </w:pPr>
+      <w:r>
+        <w:t>Conectividade das escolas (Censo Escolar e painéis do MEC sobre escolas conectadas).</w:t>
+      </w:r>
+    </w:p>
+    <w:p>
+      <w:pPr>
+        <w:pStyle w:val="ListBullet"/>
+      </w:pPr>
+      <w:r>
+        <w:t>Receita municipal e gasto em educação (Siconfi/Finbra), pendência que já vinha do cap. 5.</w:t>
+      </w:r>
+    </w:p>
+    <w:p>
+      <w:pPr>
+        <w:pStyle w:val="ListBullet"/>
+      </w:pPr>
+      <w:r>
+        <w:t>Coordenadas das localidades e das escolas, para um mapa do município na tese e na apresentação.</w:t>
+      </w:r>
+    </w:p>
+    <w:p>
+      <w:pPr>
+        <w:jc w:val="both"/>
+      </w:pPr>
+      <w:r>
+        <w:rPr>
+          <w:i w:val="0"/>
+        </w:rPr>
+        <w:t>Pedido via e-SIC: vale fazer um único pedido à SME com os itens desta lista que dependem dela, citando a Lei nº 12.527/2011, e anexar a resposta aos documentos da pesquisa.</w:t>
       </w:r>
     </w:p>
     <w:p>
@@ -1171,7 +1731,7 @@
         <w:rPr>
           <w:i w:val="0"/>
         </w:rPr>
-        <w:t>Analisar como a PNED é recontextualizada da Secretaria Municipal de Educação de Tibau do Sul até o contexto da prática da Escola Municipal Domitila Castelo da Silva, em Pipa, considerando a diversidade socioespacial do território municipal, as culturas profissionais e as condições materiais e institucionais da rede e da escola.</w:t>
+        <w:t>Analisar a recontextualização da Política Nacional de Educação Digital da Secretaria Municipal de Educação de Tibau do Sul até o contexto da prática da Escola Municipal Domitila Castelo da Silva, em Pipa, considerando a diversidade socioespacial do território municipal, as culturas profissionais e as condições materiais e institucionais da rede e da escola.</w:t>
       </w:r>
     </w:p>
     <w:p>
@@ -1179,77 +1739,7 @@
         <w:pStyle w:val="Heading2"/>
       </w:pPr>
       <w:r>
-        <w:t>5.5 Objetivos específicos</w:t>
-      </w:r>
-    </w:p>
-    <w:p>
-      <w:pPr>
-        <w:ind w:left="454" w:hanging="340"/>
-      </w:pPr>
-      <w:r>
-        <w:rPr>
-          <w:b/>
-        </w:rPr>
-        <w:t xml:space="preserve">a) Rede municipal: </w:t>
-      </w:r>
-      <w:r>
-        <w:t>Analisar como a Secretaria Municipal de Educação interpreta e traduz a PNED em planos, currículos, formações e orientações para a rede, examinando se e como esses materiais consideram as especificidades das localidades do município, entre elas as áreas rurais e a comunidade quilombola de Sibaúma.</w:t>
-      </w:r>
-    </w:p>
-    <w:p>
-      <w:pPr>
-        <w:ind w:left="454" w:hanging="340"/>
-      </w:pPr>
-      <w:r>
-        <w:rPr>
-          <w:b/>
-        </w:rPr>
-        <w:t xml:space="preserve">b) Interpretação: </w:t>
-      </w:r>
-      <w:r>
-        <w:t>Compreender como os profissionais da escola interpretam a PNED e as orientações municipais, considerando suas experiências, crenças, valores e formas de organização do trabalho.</w:t>
-      </w:r>
-    </w:p>
-    <w:p>
-      <w:pPr>
-        <w:ind w:left="454" w:hanging="340"/>
-      </w:pPr>
-      <w:r>
-        <w:rPr>
-          <w:b/>
-        </w:rPr>
-        <w:t xml:space="preserve">c) Condições e território: </w:t>
-      </w:r>
-      <w:r>
-        <w:t>Analisar como as condições materiais e institucionais da escola, articuladas às especificidades de Pipa no território municipal, atravessam a tradução da política em ações, escolhas e práticas cotidianas.</w:t>
-      </w:r>
-    </w:p>
-    <w:p>
-      <w:pPr>
-        <w:ind w:left="454" w:hanging="340"/>
-      </w:pPr>
-      <w:r>
-        <w:rPr>
-          <w:b/>
-        </w:rPr>
-        <w:t xml:space="preserve">d) Formas de atuação: </w:t>
-      </w:r>
-      <w:r>
-        <w:t>Identificar as formas de atuação produzidas diante da política e das orientações municipais, com atenção às situações em que emergem adesão, acomodação, adaptação, omissão seletiva, negociação, ressignificação ou resistência.</w:t>
-      </w:r>
-    </w:p>
-    <w:p>
-      <w:pPr>
-        <w:ind w:left="454" w:hanging="340"/>
-      </w:pPr>
-      <w:r>
-        <w:rPr>
-          <w:b/>
-        </w:rPr>
-        <w:t xml:space="preserve">e) Crianças: </w:t>
-      </w:r>
-      <w:r>
-        <w:t>Discutir as implicações dessas formas de encenação para a educação digital das crianças, considerando provisão, proteção e participação no ambiente digital.</w:t>
+        <w:t>5.5 Objetivos específicos (um verbo por objetivo)</w:t>
       </w:r>
     </w:p>
     <w:p>
@@ -1260,7 +1750,51 @@
         <w:rPr>
           <w:i w:val="0"/>
         </w:rPr>
-        <w:t>Alternativa mais enxuta: manter quatro objetivos e fundir (b) e (c), como no projeto atual, acrescentando apenas o objetivo (a) da rede.</w:t>
+        <w:t>a) Analisar a recontextualização da PNED pela Secretaria Municipal de Educação em planos, currículos, formações e orientações para a rede, considerando as especificidades das localidades do município, entre elas as áreas rurais e a comunidade quilombola de Sibaúma;</w:t>
+      </w:r>
+    </w:p>
+    <w:p>
+      <w:pPr>
+        <w:jc w:val="both"/>
+      </w:pPr>
+      <w:r>
+        <w:rPr>
+          <w:i w:val="0"/>
+        </w:rPr>
+        <w:t>b) Compreender a interpretação da PNED e das orientações municipais pelos profissionais da escola, à luz de suas experiências, crenças, valores e formas de organização do trabalho;</w:t>
+      </w:r>
+    </w:p>
+    <w:p>
+      <w:pPr>
+        <w:jc w:val="both"/>
+      </w:pPr>
+      <w:r>
+        <w:rPr>
+          <w:i w:val="0"/>
+        </w:rPr>
+        <w:t>c) Examinar a relação entre as condições materiais e institucionais da escola, articuladas às especificidades de Pipa no território municipal, e a tradução da política em ações, escolhas e práticas cotidianas;</w:t>
+      </w:r>
+    </w:p>
+    <w:p>
+      <w:pPr>
+        <w:jc w:val="both"/>
+      </w:pPr>
+      <w:r>
+        <w:rPr>
+          <w:i w:val="0"/>
+        </w:rPr>
+        <w:t>d) Identificar as formas de atuação produzidas diante da política e das orientações municipais, da adesão à resistência, e suas implicações para a provisão, a proteção e a participação das crianças no ambiente digital.</w:t>
+      </w:r>
+    </w:p>
+    <w:p>
+      <w:pPr>
+        <w:jc w:val="both"/>
+      </w:pPr>
+      <w:r>
+        <w:rPr>
+          <w:i/>
+        </w:rPr>
+        <w:t>Regra da orientadora: um único verbo no infinitivo por objetivo. As ações que antes vinham como verbos separados passaram a substantivos ou complementos do mesmo verbo.</w:t>
       </w:r>
     </w:p>
     <w:p>
@@ -1952,17 +2486,6 @@
         <w:t xml:space="preserve">3. </w:t>
       </w:r>
       <w:r>
-        <w:t>Cinco objetivos específicos ou quatro, com fusão?</w:t>
-      </w:r>
-    </w:p>
-    <w:p>
-      <w:pPr>
-        <w:ind w:left="454" w:hanging="340"/>
-      </w:pPr>
-      <w:r>
-        <w:t xml:space="preserve">4. </w:t>
-      </w:r>
-      <w:r>
         <w:t>Ouvir só o técnico da SME ou também outra pessoa da gestão (secretária, coordenação pedagógica da rede)?</w:t>
       </w:r>
     </w:p>
@@ -1971,7 +2494,7 @@
         <w:ind w:left="454" w:hanging="340"/>
       </w:pPr>
       <w:r>
-        <w:t xml:space="preserve">5. </w:t>
+        <w:t xml:space="preserve">4. </w:t>
       </w:r>
       <w:r>
         <w:t>O capítulo do território vira dois (município e escola) ou um só reorganizado?</w:t>
@@ -1982,7 +2505,7 @@
         <w:ind w:left="454" w:hanging="340"/>
       </w:pPr>
       <w:r>
-        <w:t xml:space="preserve">6. </w:t>
+        <w:t xml:space="preserve">5. </w:t>
       </w:r>
       <w:r>
         <w:t>A emenda ao CEP já foi enviada? Se não, ela precisa incorporar a nova escala antes do envio.</w:t>

</xml_diff>

<commit_message>
Atualiza a seção 2 do roteiro com os dados conferidos
Leis de criação, renomeação e emancipação; divergência de área;
portaria de Sibaúma a conferir; Domitila urbana; emenda ao CEP ainda
não enviada; contradições da versão consolidada da seção 2.

Co-Authored-By: Claude Opus 5.5 <noreply@anthropic.com>
Claude-Session: https://claude.ai/code/session_01HxStpW4pQoDfJdTDYr6zEC
</commit_message>
<xml_diff>
--- a/revisao_escala_municipal/ROTEIRO_REVISAO_SECRETARIA_A_ESCOLA.docx
+++ b/revisao_escala_municipal/ROTEIRO_REVISAO_SECRETARIA_A_ESCOLA.docx
@@ -161,7 +161,7 @@
               <w:rPr>
                 <w:sz w:val="20"/>
               </w:rPr>
-              <w:t>População de 16.929 habitantes no Censo 2022; área de cerca de 102,7 km²; densidade de 164,87 hab/km².</w:t>
+              <w:t>População de 16.929 habitantes no Censo 2022; área de cerca de 102,7 km²; densidade de 164,87 hab/km². Outra fonte dá 101,822 km²; a densidade informada só fecha com 102,7 km².</w:t>
             </w:r>
           </w:p>
         </w:tc>
@@ -174,7 +174,7 @@
               <w:rPr>
                 <w:sz w:val="20"/>
               </w:rPr>
-              <w:t>IBGE Cidades (via busca); cepsbrasil.com.br</w:t>
+              <w:t>IBGE Cidades (via busca); cepsbrasil.com.br; cidadesdomeubrasil.com.br</w:t>
             </w:r>
           </w:p>
         </w:tc>
@@ -187,7 +187,7 @@
               <w:rPr>
                 <w:sz w:val="20"/>
               </w:rPr>
-              <w:t>Conferir no IBGE</w:t>
+              <w:t>Conferir a área no IBGE Cidades</w:t>
             </w:r>
           </w:p>
         </w:tc>
@@ -202,7 +202,7 @@
               <w:rPr>
                 <w:sz w:val="20"/>
               </w:rPr>
-              <w:t>O município tem um único distrito administrativo, a sede. Criado como distrito de Goianinha em 1953 (Lei estadual nº 960), renomeado Tibau do Sul em 1958 e emancipado em 1963 (Lei estadual nº 2.863).</w:t>
+              <w:t>O município tem um único distrito administrativo, a sede. Criado como distrito de Goianinha em 1953 (Lei estadual nº 960, de 30 de novembro de 1953), renomeado Tibau do Sul pela Lei estadual nº 2.315, de 20 de dezembro de 1958, e emancipado pela Lei estadual nº 2.863, de 3 de abril de 1963. O "do Sul" distingue o município de Tibau, no litoral norte.</w:t>
             </w:r>
           </w:p>
         </w:tc>
@@ -284,7 +284,7 @@
               <w:rPr>
                 <w:sz w:val="20"/>
               </w:rPr>
-              <w:t>Sibaúma é certificada pela Fundação Cultural Palmares como comunidade remanescente de quilombo, em 2005 (uma fonte dá a data de 8 de junho de 2005).</w:t>
+              <w:t>Sibaúma é certificada pela Fundação Cultural Palmares como comunidade remanescente de quilombo, em 2005 (uma fonte dá a data de 8 de junho de 2005). A pesquisadora indica a Portaria nº 26/2005 e o Processo nº 01420.000658/2004-75.</w:t>
             </w:r>
           </w:p>
         </w:tc>
@@ -297,7 +297,7 @@
               <w:rPr>
                 <w:sz w:val="20"/>
               </w:rPr>
-              <w:t>MPF/RN; artigos acadêmicos (via busca)</w:t>
+              <w:t>MPF/RN; artigos acadêmicos (via busca); número da portaria informado pela pesquisadora</w:t>
             </w:r>
           </w:p>
         </w:tc>
@@ -310,7 +310,7 @@
               <w:rPr>
                 <w:sz w:val="20"/>
               </w:rPr>
-              <w:t>Confirmar na lista da Palmares</w:t>
+              <w:t>O número da portaria não apareceu nas buscas; conferir no DOU e na lista da Palmares</w:t>
             </w:r>
           </w:p>
         </w:tc>
@@ -392,7 +392,7 @@
               <w:rPr>
                 <w:sz w:val="20"/>
               </w:rPr>
-              <w:t>Autoria não confirmada; localizar o PDF</w:t>
+              <w:t>Autoria e orientação não apareceram nas buscas; ver repositorio.ufrn.br/jspui/handle/123456789/14505</w:t>
             </w:r>
           </w:p>
         </w:tc>
@@ -448,7 +448,7 @@
               <w:rPr>
                 <w:sz w:val="20"/>
               </w:rPr>
-              <w:t>Outras escolas municipais citadas: Dr. Hélio Galvão, Joaquim Delvito, Maria Zulma de Carvalho Lopes (zona rural), Presidente Costa e Silva, José Jerônimo Galvão e Vicência Castelo (Pipa).</w:t>
+              <w:t>Outras escolas municipais citadas: Dr. Hélio Galvão, Joaquim Delvito (Sítio Pernambuquinho), Maria Zulma de Carvalho Lopes (Sítio Munim, zona rural), Presidente Costa e Silva, José Jerônimo Galvão e Vicência Castelo (Praia de Pipa).</w:t>
             </w:r>
           </w:p>
         </w:tc>
@@ -538,10 +538,10 @@
         <w:rPr>
           <w:b/>
         </w:rPr>
-        <w:t xml:space="preserve">Domitila urbana ou rural? </w:t>
+        <w:t xml:space="preserve">Domitila: urbana. </w:t>
       </w:r>
       <w:r>
-        <w:t>Localização da Escola Domitila: o endereço indicado é a Rua dos Colibris, Praia de Pipa, mas um agregador a lista entre as escolas da zona rural. A classificação oficial (urbana ou rural) está no Censo Escolar e precisa ser conferida, porque muda a leitura do caso.</w:t>
+        <w:t>O endereço indicado é a Rua dos Colibris, Praia de Pipa, e um agregador a listou entre as escolas da zona rural. A pesquisadora confirmou que a escola é urbana. Na tese, a classificação deve vir com a ficha do Catálogo de Escolas do INEP, porque é ela que sustenta a afirmação.</w:t>
       </w:r>
     </w:p>
     <w:p>
@@ -1086,6 +1086,48 @@
     </w:p>
     <w:p>
       <w:pPr>
+        <w:pStyle w:val="ListBullet"/>
+      </w:pPr>
+      <w:r>
+        <w:rPr>
+          <w:b/>
+        </w:rPr>
+        <w:t xml:space="preserve">Números já informados. </w:t>
+      </w:r>
+      <w:r>
+        <w:t>A versão consolidada da seção 2 escrita pela pesquisadora diz que a população quilombola e a divisão urbano/rural ainda precisam ser quantificadas, mas a seção 2.3 já traz 903 quilombolas (Censo 2022) e 6.861 urbanos e 4.524 rurais (Censo 2010). Os dois textos precisam dizer a mesma coisa: os números entram como dados a conferir na fonte.</w:t>
+      </w:r>
+    </w:p>
+    <w:p>
+      <w:pPr>
+        <w:pStyle w:val="ListBullet"/>
+      </w:pPr>
+      <w:r>
+        <w:rPr>
+          <w:b/>
+        </w:rPr>
+        <w:t xml:space="preserve">Fala do técnico e pedidos. </w:t>
+      </w:r>
+      <w:r>
+        <w:t>A versão consolidada atribui ao técnico a menção a "ações ou planos". O registro da conversa é mais preciso: ele disse que existe um plano elaborado para a rede como um todo. A mesma versão diz que a coleta na SME ainda exige ida a campo, mas os documentos já foram solicitados ao técnico e à direção da escola.</w:t>
+      </w:r>
+    </w:p>
+    <w:p>
+      <w:pPr>
+        <w:pStyle w:val="ListBullet"/>
+      </w:pPr>
+      <w:r>
+        <w:rPr>
+          <w:b/>
+        </w:rPr>
+        <w:t xml:space="preserve">Programas federais. </w:t>
+      </w:r>
+      <w:r>
+        <w:t>O PNATE atende o transporte de estudantes da zona rural, e o FUNDEB tem ponderação própria para escolas do campo; no PNAE, o valor diferenciado recai sobre escolas quilombolas e indígenas. Antes de afirmar que a classificação urbana ou rural muda transporte e merenda, é preciso citar as normas de cada programa.</w:t>
+      </w:r>
+    </w:p>
+    <w:p>
+      <w:pPr>
         <w:pStyle w:val="Heading2"/>
       </w:pPr>
       <w:r>
@@ -2508,7 +2550,7 @@
         <w:t xml:space="preserve">5. </w:t>
       </w:r>
       <w:r>
-        <w:t>A emenda ao CEP já foi enviada? Se não, ela precisa incorporar a nova escala antes do envio.</w:t>
+        <w:t>Emenda ao CEP: ainda não foi enviada. Antes do envio, ela precisa incluir a SME como instituição coparticipante, o técnico como participante e o roteiro da entrevista dele.</w:t>
       </w:r>
     </w:p>
     <w:p>

</xml_diff>

<commit_message>
Registra no roteiro a autoria da dissertação, a portaria de Sibaúma e a área
Co-Authored-By: Claude Opus 5.5 <noreply@anthropic.com>
Claude-Session: https://claude.ai/code/session_01HxStpW4pQoDfJdTDYr6zEC
</commit_message>
<xml_diff>
--- a/revisao_escala_municipal/ROTEIRO_REVISAO_SECRETARIA_A_ESCOLA.docx
+++ b/revisao_escala_municipal/ROTEIRO_REVISAO_SECRETARIA_A_ESCOLA.docx
@@ -187,7 +187,7 @@
               <w:rPr>
                 <w:sz w:val="20"/>
               </w:rPr>
-              <w:t>Conferir a área no IBGE Cidades</w:t>
+              <w:t>Área de 102,68 km² (IBGE, 2025), confirmada na busca; usar este valor</w:t>
             </w:r>
           </w:p>
         </w:tc>
@@ -297,7 +297,7 @@
               <w:rPr>
                 <w:sz w:val="20"/>
               </w:rPr>
-              <w:t>MPF/RN; artigos acadêmicos (via busca); número da portaria informado pela pesquisadora</w:t>
+              <w:t>MPF/RN; Comissão Pró-Índio de São Paulo, página Terra Quilombola Sibaúma (via busca)</w:t>
             </w:r>
           </w:p>
         </w:tc>
@@ -310,7 +310,7 @@
               <w:rPr>
                 <w:sz w:val="20"/>
               </w:rPr>
-              <w:t>O número da portaria não apareceu nas buscas; conferir no DOU e na lista da Palmares</w:t>
+              <w:t>Portaria nº 26, de 6 de junho de 2005, publicada no DOU de 8 de junho de 2005, confirmada em fonte secundária; citar o DOU. O número do processo não foi confirmado</w:t>
             </w:r>
           </w:p>
         </w:tc>
@@ -379,7 +379,7 @@
               <w:rPr>
                 <w:sz w:val="20"/>
               </w:rPr>
-              <w:t>Repositório da UFRN e BDTD (via busca)</w:t>
+              <w:t>Repositório da UFRN e BDTD (via busca); bibliografia da CPI-SP</w:t>
             </w:r>
           </w:p>
         </w:tc>
@@ -392,7 +392,7 @@
               <w:rPr>
                 <w:sz w:val="20"/>
               </w:rPr>
-              <w:t>Autoria e orientação não apareceram nas buscas; ver repositorio.ufrn.br/jspui/handle/123456789/14505</w:t>
+              <w:t>Autora: Terezinha Martins da Silva (confirmada em fonte secundária). Ano divergente: 2011 na CPI-SP, 2012 na BDTD. Conferir ano e orientação na folha de rosto</w:t>
             </w:r>
           </w:p>
         </w:tc>
@@ -713,7 +713,7 @@
               <w:rPr>
                 <w:sz w:val="20"/>
               </w:rPr>
-              <w:t>Falta a fonte: lei municipal, cadastro da Prefeitura ou base de localidades do IBGE</w:t>
+              <w:t>A resposta recebida cita, de forma genérica, "recortes da Prefeitura", "registros do IBGE" e portais turísticos, sem documento identificável</w:t>
             </w:r>
           </w:p>
         </w:tc>
@@ -726,7 +726,7 @@
               <w:rPr>
                 <w:sz w:val="20"/>
               </w:rPr>
-              <w:t>Sem fonte; "oficialmente" não pode ser afirmado</w:t>
+              <w:t>Ainda sem fonte citável; pedir à SME ou à Prefeitura a relação oficial, ou usar a base de localidades do IBGE</w:t>
             </w:r>
           </w:p>
         </w:tc>
@@ -767,7 +767,7 @@
               <w:rPr>
                 <w:sz w:val="20"/>
               </w:rPr>
-              <w:t>Conferir; a busca aqui não encontrou a lei</w:t>
+              <w:t>Texto ainda não localizado; perguntar à SME se houve prorrogação ou nova lei para 2026-2035</w:t>
             </w:r>
           </w:p>
         </w:tc>
@@ -808,7 +808,7 @@
               <w:rPr>
                 <w:sz w:val="20"/>
               </w:rPr>
-              <w:t>Conferir o código e a localização</w:t>
+              <w:t>Urbana, confirmada pela pesquisadora; a busca não trouxe a ficha. Anexar a ficha do Catálogo de Escolas</w:t>
             </w:r>
           </w:p>
         </w:tc>
@@ -877,7 +877,7 @@
               <w:rPr>
                 <w:sz w:val="20"/>
               </w:rPr>
-              <w:t>INEP/QEdu, com ano de referência</w:t>
+              <w:t>Atribuídas ao Censo Escolar/INEP, sem ano nem tabela</w:t>
             </w:r>
           </w:p>
         </w:tc>
@@ -890,7 +890,7 @@
               <w:rPr>
                 <w:sz w:val="20"/>
               </w:rPr>
-              <w:t>Conferir; separar rede municipal e estadual</w:t>
+              <w:t>Falta o ano e a tabela; o número segue baixo diante das 351 crianças só dos anos iniciais da Domitila</w:t>
             </w:r>
           </w:p>
         </w:tc>
@@ -931,7 +931,7 @@
               <w:rPr>
                 <w:sz w:val="20"/>
               </w:rPr>
-              <w:t>Conferir</w:t>
+              <w:t>O ano 2023 é suposição da resposta recebida ("geralmente"); conferir no painel do IDEB</w:t>
             </w:r>
           </w:p>
         </w:tc>

</xml_diff>

<commit_message>
Atualiza no roteiro o IDEB, as matrículas e os documentos da Prefeitura
Co-Authored-By: Claude Opus 5.5 <noreply@anthropic.com>
Claude-Session: https://claude.ai/code/session_01HxStpW4pQoDfJdTDYr6zEC
</commit_message>
<xml_diff>
--- a/revisao_escala_municipal/ROTEIRO_REVISAO_SECRETARIA_A_ESCOLA.docx
+++ b/revisao_escala_municipal/ROTEIRO_REVISAO_SECRETARIA_A_ESCOLA.docx
@@ -890,7 +890,7 @@
               <w:rPr>
                 <w:sz w:val="20"/>
               </w:rPr>
-              <w:t>Falta o ano e a tabela; o número segue baixo diante das 351 crianças só dos anos iniciais da Domitila</w:t>
+              <w:t>Atribuído ao QEdu, Censo Escolar 2025; a busca não confirmou. O número segue baixo diante das 351 crianças só dos anos iniciais da Domitila. A rede pública inclui ao menos uma escola estadual, a EE Prof. José Mamede (centro). Citar os microdados ou a Sinopse Estatística do Censo Escolar, separando etapas e redes</w:t>
             </w:r>
           </w:p>
         </w:tc>
@@ -931,7 +931,7 @@
               <w:rPr>
                 <w:sz w:val="20"/>
               </w:rPr>
-              <w:t>O ano 2023 é suposição da resposta recebida ("geralmente"); conferir no painel do IDEB</w:t>
+              <w:t>A pesquisadora indica agora o IDEB 2025 (divulgado em 5/8/2026, fato confirmado). Os valores do município não apareceram na busca. O IBGE Cidades registra, para 2023, 4,6 nos anos iniciais e 3,8 nos anos finais da rede pública. Conferir na planilha "Resultados do Ideb – Municípios" 2025, distinguindo rede municipal e rede pública</w:t>
             </w:r>
           </w:p>
         </w:tc>
@@ -2423,6 +2423,14 @@
         <w:pStyle w:val="ListBullet"/>
       </w:pPr>
       <w:r>
+        <w:t>Na Prefeitura: Plano Diretor, Lei Orgânica e mapa ou memorial descritivo oficial, para a relação das localidades e os limites entre área urbana e rural. A busca exploratória não encontrou esses documentos.</w:t>
+      </w:r>
+    </w:p>
+    <w:p>
+      <w:pPr>
+        <w:pStyle w:val="ListBullet"/>
+      </w:pPr>
+      <w:r>
         <w:t>Documentos sobre educação escolar quilombola na rede, em especial na escola de Sibaúma.</w:t>
       </w:r>
     </w:p>

</xml_diff>